<commit_message>
Rewrite poem and article for Class 11 CBSE PCM student
Co-Authored-By: Claude Sonnet 5.5 <noreply@anthropic.com>
Claude-Session: https://claude.ai/code/session_012GAv3e2vpNu6ME8nffNn6K
</commit_message>
<xml_diff>
--- a/School_Magazine_Poem_and_Article.docx
+++ b/School_Magazine_Poem_and_Article.docx
@@ -14,7 +14,7 @@
           <w:sz w:val="24"/>
           <w:szCs w:val="24"/>
         </w:rPr>
-        <w:t xml:space="preserve">Name: ____________________    Class: ______    Section: ______</w:t>
+        <w:t xml:space="preserve">Name: ____________________    Class: XI (PCM, CBSE)    Section: ______</w:t>
       </w:r>
     </w:p>
     <w:p>
@@ -76,189 +76,245 @@
           <w:sz w:val="24"/>
           <w:szCs w:val="24"/>
         </w:rPr>
-        <w:t xml:space="preserve">Education is a lamp that lights our way,</w:t>
-      </w:r>
-    </w:p>
-    <w:p>
-      <w:pPr>
-        <w:spacing w:after="240" w:line="300"/>
-        <w:jc w:val="center"/>
-      </w:pPr>
-      <w:r>
-        <w:rPr>
-          <w:rFonts w:ascii="Times New Roman" w:cs="Times New Roman" w:eastAsia="Times New Roman" w:hAnsi="Times New Roman"/>
-          <w:sz w:val="24"/>
-          <w:szCs w:val="24"/>
-        </w:rPr>
-        <w:t xml:space="preserve">It chases all the darkness far away.</w:t>
-      </w:r>
-    </w:p>
-    <w:p>
-      <w:pPr>
-        <w:spacing w:after="0" w:line="300"/>
-        <w:jc w:val="center"/>
-      </w:pPr>
-      <w:r>
-        <w:rPr>
-          <w:rFonts w:ascii="Times New Roman" w:cs="Times New Roman" w:eastAsia="Times New Roman" w:hAnsi="Times New Roman"/>
-          <w:sz w:val="24"/>
-          <w:szCs w:val="24"/>
-        </w:rPr>
-        <w:t xml:space="preserve">With school bags on our backs we walk each day,</w:t>
-      </w:r>
-    </w:p>
-    <w:p>
-      <w:pPr>
-        <w:spacing w:after="240" w:line="300"/>
-        <w:jc w:val="center"/>
-      </w:pPr>
-      <w:r>
-        <w:rPr>
-          <w:rFonts w:ascii="Times New Roman" w:cs="Times New Roman" w:eastAsia="Times New Roman" w:hAnsi="Times New Roman"/>
-          <w:sz w:val="24"/>
-          <w:szCs w:val="24"/>
-        </w:rPr>
-        <w:t xml:space="preserve">To learn, to laugh, to grow, to play.</w:t>
-      </w:r>
-    </w:p>
-    <w:p>
-      <w:pPr>
-        <w:spacing w:after="0" w:line="300"/>
-        <w:jc w:val="center"/>
-      </w:pPr>
-      <w:r>
-        <w:rPr>
-          <w:rFonts w:ascii="Times New Roman" w:cs="Times New Roman" w:eastAsia="Times New Roman" w:hAnsi="Times New Roman"/>
-          <w:sz w:val="24"/>
-          <w:szCs w:val="24"/>
-        </w:rPr>
-        <w:t xml:space="preserve">Our teachers guide us with a patient hand,</w:t>
-      </w:r>
-    </w:p>
-    <w:p>
-      <w:pPr>
-        <w:spacing w:after="240" w:line="300"/>
-        <w:jc w:val="center"/>
-      </w:pPr>
-      <w:r>
-        <w:rPr>
-          <w:rFonts w:ascii="Times New Roman" w:cs="Times New Roman" w:eastAsia="Times New Roman" w:hAnsi="Times New Roman"/>
-          <w:sz w:val="24"/>
-          <w:szCs w:val="24"/>
-        </w:rPr>
-        <w:t xml:space="preserve">They help us dream and help us understand.</w:t>
-      </w:r>
-    </w:p>
-    <w:p>
-      <w:pPr>
-        <w:spacing w:after="0" w:line="300"/>
-        <w:jc w:val="center"/>
-      </w:pPr>
-      <w:r>
-        <w:rPr>
-          <w:rFonts w:ascii="Times New Roman" w:cs="Times New Roman" w:eastAsia="Times New Roman" w:hAnsi="Times New Roman"/>
-          <w:sz w:val="24"/>
-          <w:szCs w:val="24"/>
-        </w:rPr>
-        <w:t xml:space="preserve">From ABC to numbers, maps and science too,</w:t>
-      </w:r>
-    </w:p>
-    <w:p>
-      <w:pPr>
-        <w:spacing w:after="240" w:line="300"/>
-        <w:jc w:val="center"/>
-      </w:pPr>
-      <w:r>
-        <w:rPr>
-          <w:rFonts w:ascii="Times New Roman" w:cs="Times New Roman" w:eastAsia="Times New Roman" w:hAnsi="Times New Roman"/>
-          <w:sz w:val="24"/>
-          <w:szCs w:val="24"/>
-        </w:rPr>
-        <w:t xml:space="preserve">Each lesson opens doors to something new.</w:t>
-      </w:r>
-    </w:p>
-    <w:p>
-      <w:pPr>
-        <w:spacing w:after="0" w:line="300"/>
-        <w:jc w:val="center"/>
-      </w:pPr>
-      <w:r>
-        <w:rPr>
-          <w:rFonts w:ascii="Times New Roman" w:cs="Times New Roman" w:eastAsia="Times New Roman" w:hAnsi="Times New Roman"/>
-          <w:sz w:val="24"/>
-          <w:szCs w:val="24"/>
-        </w:rPr>
-        <w:t xml:space="preserve">Gandhi and Kalam, heroes of our land,</w:t>
-      </w:r>
-    </w:p>
-    <w:p>
-      <w:pPr>
-        <w:spacing w:after="240" w:line="300"/>
-        <w:jc w:val="center"/>
-      </w:pPr>
-      <w:r>
-        <w:rPr>
-          <w:rFonts w:ascii="Times New Roman" w:cs="Times New Roman" w:eastAsia="Times New Roman" w:hAnsi="Times New Roman"/>
-          <w:sz w:val="24"/>
-          <w:szCs w:val="24"/>
-        </w:rPr>
-        <w:t xml:space="preserve">Showed knowledge is a power, grand.</w:t>
-      </w:r>
-    </w:p>
-    <w:p>
-      <w:pPr>
-        <w:spacing w:after="0" w:line="300"/>
-        <w:jc w:val="center"/>
-      </w:pPr>
-      <w:r>
-        <w:rPr>
-          <w:rFonts w:ascii="Times New Roman" w:cs="Times New Roman" w:eastAsia="Times New Roman" w:hAnsi="Times New Roman"/>
-          <w:sz w:val="24"/>
-          <w:szCs w:val="24"/>
-        </w:rPr>
-        <w:t xml:space="preserve">Friends who share their tiffin and their smile,</w:t>
-      </w:r>
-    </w:p>
-    <w:p>
-      <w:pPr>
-        <w:spacing w:after="240" w:line="300"/>
-        <w:jc w:val="center"/>
-      </w:pPr>
-      <w:r>
-        <w:rPr>
-          <w:rFonts w:ascii="Times New Roman" w:cs="Times New Roman" w:eastAsia="Times New Roman" w:hAnsi="Times New Roman"/>
-          <w:sz w:val="24"/>
-          <w:szCs w:val="24"/>
-        </w:rPr>
-        <w:t xml:space="preserve">Make every hour in class worthwhile.</w:t>
-      </w:r>
-    </w:p>
-    <w:p>
-      <w:pPr>
-        <w:spacing w:after="0" w:line="300"/>
-        <w:jc w:val="center"/>
-      </w:pPr>
-      <w:r>
-        <w:rPr>
-          <w:rFonts w:ascii="Times New Roman" w:cs="Times New Roman" w:eastAsia="Times New Roman" w:hAnsi="Times New Roman"/>
-          <w:sz w:val="24"/>
-          <w:szCs w:val="24"/>
-        </w:rPr>
-        <w:t xml:space="preserve">So let us study with honest heart and mind,</w:t>
-      </w:r>
-    </w:p>
-    <w:p>
-      <w:pPr>
-        <w:spacing w:after="240" w:line="300"/>
-        <w:jc w:val="center"/>
-      </w:pPr>
-      <w:r>
-        <w:rPr>
-          <w:rFonts w:ascii="Times New Roman" w:cs="Times New Roman" w:eastAsia="Times New Roman" w:hAnsi="Times New Roman"/>
-          <w:sz w:val="24"/>
-          <w:szCs w:val="24"/>
-        </w:rPr>
-        <w:t xml:space="preserve">And leave our shame and laziness behind.</w:t>
+        <w:t xml:space="preserve">Education is a lamp that lights my way,</w:t>
+      </w:r>
+    </w:p>
+    <w:p>
+      <w:pPr>
+        <w:spacing w:after="240" w:line="300"/>
+        <w:jc w:val="center"/>
+      </w:pPr>
+      <w:r>
+        <w:rPr>
+          <w:rFonts w:ascii="Times New Roman" w:cs="Times New Roman" w:eastAsia="Times New Roman" w:hAnsi="Times New Roman"/>
+          <w:sz w:val="24"/>
+          <w:szCs w:val="24"/>
+        </w:rPr>
+        <w:t xml:space="preserve">It pushes all the darkness far away.</w:t>
+      </w:r>
+    </w:p>
+    <w:p>
+      <w:pPr>
+        <w:spacing w:after="0" w:line="300"/>
+        <w:jc w:val="center"/>
+      </w:pPr>
+      <w:r>
+        <w:rPr>
+          <w:rFonts w:ascii="Times New Roman" w:cs="Times New Roman" w:eastAsia="Times New Roman" w:hAnsi="Times New Roman"/>
+          <w:sz w:val="24"/>
+          <w:szCs w:val="24"/>
+        </w:rPr>
+        <w:t xml:space="preserve">In Physics I chase the speed of light,</w:t>
+      </w:r>
+    </w:p>
+    <w:p>
+      <w:pPr>
+        <w:spacing w:after="240" w:line="300"/>
+        <w:jc w:val="center"/>
+      </w:pPr>
+      <w:r>
+        <w:rPr>
+          <w:rFonts w:ascii="Times New Roman" w:cs="Times New Roman" w:eastAsia="Times New Roman" w:hAnsi="Times New Roman"/>
+          <w:sz w:val="24"/>
+          <w:szCs w:val="24"/>
+        </w:rPr>
+        <w:t xml:space="preserve">Newton's laws still hold me tight.</w:t>
+      </w:r>
+    </w:p>
+    <w:p>
+      <w:pPr>
+        <w:spacing w:after="0" w:line="300"/>
+        <w:jc w:val="center"/>
+      </w:pPr>
+      <w:r>
+        <w:rPr>
+          <w:rFonts w:ascii="Times New Roman" w:cs="Times New Roman" w:eastAsia="Times New Roman" w:hAnsi="Times New Roman"/>
+          <w:sz w:val="24"/>
+          <w:szCs w:val="24"/>
+        </w:rPr>
+        <w:t xml:space="preserve">In Chemistry the bonds and moles I learn,</w:t>
+      </w:r>
+    </w:p>
+    <w:p>
+      <w:pPr>
+        <w:spacing w:after="240" w:line="300"/>
+        <w:jc w:val="center"/>
+      </w:pPr>
+      <w:r>
+        <w:rPr>
+          <w:rFonts w:ascii="Times New Roman" w:cs="Times New Roman" w:eastAsia="Times New Roman" w:hAnsi="Times New Roman"/>
+          <w:sz w:val="24"/>
+          <w:szCs w:val="24"/>
+        </w:rPr>
+        <w:t xml:space="preserve">Each reaction makes my curiosity burn.</w:t>
+      </w:r>
+    </w:p>
+    <w:p>
+      <w:pPr>
+        <w:spacing w:after="0" w:line="300"/>
+        <w:jc w:val="center"/>
+      </w:pPr>
+      <w:r>
+        <w:rPr>
+          <w:rFonts w:ascii="Times New Roman" w:cs="Times New Roman" w:eastAsia="Times New Roman" w:hAnsi="Times New Roman"/>
+          <w:sz w:val="24"/>
+          <w:szCs w:val="24"/>
+        </w:rPr>
+        <w:t xml:space="preserve">In Maths a tough integral makes me sigh,</w:t>
+      </w:r>
+    </w:p>
+    <w:p>
+      <w:pPr>
+        <w:spacing w:after="240" w:line="300"/>
+        <w:jc w:val="center"/>
+      </w:pPr>
+      <w:r>
+        <w:rPr>
+          <w:rFonts w:ascii="Times New Roman" w:cs="Times New Roman" w:eastAsia="Times New Roman" w:hAnsi="Times New Roman"/>
+          <w:sz w:val="24"/>
+          <w:szCs w:val="24"/>
+        </w:rPr>
+        <w:t xml:space="preserve">Till the answer comes and I smile, sky-high.</w:t>
+      </w:r>
+    </w:p>
+    <w:p>
+      <w:pPr>
+        <w:spacing w:after="0" w:line="300"/>
+        <w:jc w:val="center"/>
+      </w:pPr>
+      <w:r>
+        <w:rPr>
+          <w:rFonts w:ascii="Times New Roman" w:cs="Times New Roman" w:eastAsia="Times New Roman" w:hAnsi="Times New Roman"/>
+          <w:sz w:val="24"/>
+          <w:szCs w:val="24"/>
+        </w:rPr>
+        <w:t xml:space="preserve">Late-night notes and a cup of tea,</w:t>
+      </w:r>
+    </w:p>
+    <w:p>
+      <w:pPr>
+        <w:spacing w:after="240" w:line="300"/>
+        <w:jc w:val="center"/>
+      </w:pPr>
+      <w:r>
+        <w:rPr>
+          <w:rFonts w:ascii="Times New Roman" w:cs="Times New Roman" w:eastAsia="Times New Roman" w:hAnsi="Times New Roman"/>
+          <w:sz w:val="24"/>
+          <w:szCs w:val="24"/>
+        </w:rPr>
+        <w:t xml:space="preserve">Mistakes in tests teach more to me.</w:t>
+      </w:r>
+    </w:p>
+    <w:p>
+      <w:pPr>
+        <w:spacing w:after="0" w:line="300"/>
+        <w:jc w:val="center"/>
+      </w:pPr>
+      <w:r>
+        <w:rPr>
+          <w:rFonts w:ascii="Times New Roman" w:cs="Times New Roman" w:eastAsia="Times New Roman" w:hAnsi="Times New Roman"/>
+          <w:sz w:val="24"/>
+          <w:szCs w:val="24"/>
+        </w:rPr>
+        <w:t xml:space="preserve">Teachers who guide with a patient hand,</w:t>
+      </w:r>
+    </w:p>
+    <w:p>
+      <w:pPr>
+        <w:spacing w:after="240" w:line="300"/>
+        <w:jc w:val="center"/>
+      </w:pPr>
+      <w:r>
+        <w:rPr>
+          <w:rFonts w:ascii="Times New Roman" w:cs="Times New Roman" w:eastAsia="Times New Roman" w:hAnsi="Times New Roman"/>
+          <w:sz w:val="24"/>
+          <w:szCs w:val="24"/>
+        </w:rPr>
+        <w:t xml:space="preserve">Help me dream and help me understand.</w:t>
+      </w:r>
+    </w:p>
+    <w:p>
+      <w:pPr>
+        <w:spacing w:after="0" w:line="300"/>
+        <w:jc w:val="center"/>
+      </w:pPr>
+      <w:r>
+        <w:rPr>
+          <w:rFonts w:ascii="Times New Roman" w:cs="Times New Roman" w:eastAsia="Times New Roman" w:hAnsi="Times New Roman"/>
+          <w:sz w:val="24"/>
+          <w:szCs w:val="24"/>
+        </w:rPr>
+        <w:t xml:space="preserve">Kalam looked up and dreamed of flight,</w:t>
+      </w:r>
+    </w:p>
+    <w:p>
+      <w:pPr>
+        <w:spacing w:after="240" w:line="300"/>
+        <w:jc w:val="center"/>
+      </w:pPr>
+      <w:r>
+        <w:rPr>
+          <w:rFonts w:ascii="Times New Roman" w:cs="Times New Roman" w:eastAsia="Times New Roman" w:hAnsi="Times New Roman"/>
+          <w:sz w:val="24"/>
+          <w:szCs w:val="24"/>
+        </w:rPr>
+        <w:t xml:space="preserve">Ramanujan saw numbers in the night.</w:t>
+      </w:r>
+    </w:p>
+    <w:p>
+      <w:pPr>
+        <w:spacing w:after="0" w:line="300"/>
+        <w:jc w:val="center"/>
+      </w:pPr>
+      <w:r>
+        <w:rPr>
+          <w:rFonts w:ascii="Times New Roman" w:cs="Times New Roman" w:eastAsia="Times New Roman" w:hAnsi="Times New Roman"/>
+          <w:sz w:val="24"/>
+          <w:szCs w:val="24"/>
+        </w:rPr>
+        <w:t xml:space="preserve">Class eleven is a journey just begun,</w:t>
+      </w:r>
+    </w:p>
+    <w:p>
+      <w:pPr>
+        <w:spacing w:after="240" w:line="300"/>
+        <w:jc w:val="center"/>
+      </w:pPr>
+      <w:r>
+        <w:rPr>
+          <w:rFonts w:ascii="Times New Roman" w:cs="Times New Roman" w:eastAsia="Times New Roman" w:hAnsi="Times New Roman"/>
+          <w:sz w:val="24"/>
+          <w:szCs w:val="24"/>
+        </w:rPr>
+        <w:t xml:space="preserve">With JEE, boards and dreams, I will not run.</w:t>
+      </w:r>
+    </w:p>
+    <w:p>
+      <w:pPr>
+        <w:spacing w:after="0" w:line="300"/>
+        <w:jc w:val="center"/>
+      </w:pPr>
+      <w:r>
+        <w:rPr>
+          <w:rFonts w:ascii="Times New Roman" w:cs="Times New Roman" w:eastAsia="Times New Roman" w:hAnsi="Times New Roman"/>
+          <w:sz w:val="24"/>
+          <w:szCs w:val="24"/>
+        </w:rPr>
+        <w:t xml:space="preserve">So with honest effort and a hopeful mind,</w:t>
+      </w:r>
+    </w:p>
+    <w:p>
+      <w:pPr>
+        <w:spacing w:after="240" w:line="300"/>
+        <w:jc w:val="center"/>
+      </w:pPr>
+      <w:r>
+        <w:rPr>
+          <w:rFonts w:ascii="Times New Roman" w:cs="Times New Roman" w:eastAsia="Times New Roman" w:hAnsi="Times New Roman"/>
+          <w:sz w:val="24"/>
+          <w:szCs w:val="24"/>
+        </w:rPr>
+        <w:t xml:space="preserve">I'll leave my fear and doubts behind.</w:t>
       </w:r>
     </w:p>
     <w:p>
@@ -306,7 +362,7 @@
           <w:sz w:val="24"/>
           <w:szCs w:val="24"/>
         </w:rPr>
-        <w:t xml:space="preserve">Name: ____________________    Class: ______    Section: ______</w:t>
+        <w:t xml:space="preserve">Name: ____________________    Class: XI (PCM, CBSE)    Section: ______</w:t>
       </w:r>
     </w:p>
     <w:p>
@@ -368,7 +424,7 @@
           <w:sz w:val="24"/>
           <w:szCs w:val="24"/>
         </w:rPr>
-        <w:t xml:space="preserve">Education is the most precious gift a person can receive. In India, we respect our teachers as much as our parents, and the saying "Guru Brahma, Guru Vishnu" reminds us of this. A school is not only a building with classrooms and a playground. It is a place where we build our character, make friends and learn to become good citizens.</w:t>
+        <w:t xml:space="preserve">When I entered class 11 in the CBSE board with Physics, Chemistry and Maths, I felt both excited and nervous. The syllabus suddenly looked huge, and the jump from class 10 was real. But slowly I understood that education is not about mugging up pages. It is about understanding why things happen.</w:t>
       </w:r>
     </w:p>
     <w:p>
@@ -382,7 +438,7 @@
           <w:sz w:val="24"/>
           <w:szCs w:val="24"/>
         </w:rPr>
-        <w:t xml:space="preserve">In school we do not only read textbooks. We learn discipline by coming to class on time, teamwork by playing sports, and confidence by speaking in assembly. Activities like science exhibitions, debates, drawing and music help us find our hidden talents. Our teachers work hard to make us understand difficult topics and always encourage us to ask questions.</w:t>
+        <w:t xml:space="preserve">Physics taught me to look at the world differently. When I learnt Newton's laws of motion and projectile motion, I started noticing them in a cricket match, in a moving bus and even in a falling water drop. Chemistry showed me that everything around us, from the salt in our kitchen to the air we breathe, is made of atoms and bonds. Maths trained my mind to be patient. A tough problem in calculus or trigonometry may take an hour, but the happiness of reaching the correct answer is something no one can describe.</w:t>
       </w:r>
     </w:p>
     <w:p>
@@ -396,7 +452,7 @@
           <w:sz w:val="24"/>
           <w:szCs w:val="24"/>
         </w:rPr>
-        <w:t xml:space="preserve">As students of classes 9 and 10, we feel the pressure of board exams and competition. Sometimes we worry about marks. But true education is not just scoring high; it is understanding what we learn and using it wisely. Honesty, kindness and curiosity are as important as good results.</w:t>
+        <w:t xml:space="preserve">Of course, it is not always easy. There are days when numericals do not match the answer key, and unit tests bring stress. Many of us also think about JEE and other entrance exams and worry about marks. In those moments my teachers and parents told me to focus on concepts and not only on ranks. Practising NCERT questions first, then reference books, and learning from my mistakes has helped me more than any shortcut.</w:t>
       </w:r>
     </w:p>
     <w:p>
@@ -410,7 +466,7 @@
           <w:sz w:val="24"/>
           <w:szCs w:val="24"/>
         </w:rPr>
-        <w:t xml:space="preserve">Our country has also taken big steps, such as the Right to Education Act, digital classrooms and the New Education Policy, so that every child can go to school. Still, many children in villages do not get this chance. We should help them by sharing books, teaching younger children and spreading awareness.</w:t>
+        <w:t xml:space="preserve">We are lucky to have heroes from our own country. Dr. A.P.J. Abdul Kalam, a scientist who became the President, showed that a simple background is no barrier to big dreams. Srinivasa Ramanujan, with very little formal training, gave the world brilliant mathematics. Their lives remind us that hard work and curiosity matter more than facilities.</w:t>
       </w:r>
     </w:p>
     <w:p>
@@ -424,7 +480,36 @@
           <w:sz w:val="24"/>
           <w:szCs w:val="24"/>
         </w:rPr>
-        <w:t xml:space="preserve">In conclusion, education makes us wise, independent and responsible. If every child in India studies well and uses knowledge for good, our nation will become strong and developed. As Nelson Mandela said, "Education is the most powerful weapon which you can use to change the world."</w:t>
+        <w:t xml:space="preserve">I believe education should also make us good human beings. Along with formulas, we must learn honesty, kindness and a willingness to help others. Sharing notes with a friend who is struggling or explaining a concept to a junior makes us understand it better ourselves.</w:t>
+      </w:r>
+    </w:p>
+    <w:p>
+      <w:pPr>
+        <w:spacing w:after="160" w:line="300"/>
+        <w:jc w:val="both"/>
+      </w:pPr>
+      <w:r>
+        <w:rPr>
+          <w:rFonts w:ascii="Times New Roman" w:cs="Times New Roman" w:eastAsia="Times New Roman" w:hAnsi="Times New Roman"/>
+          <w:sz w:val="24"/>
+          <w:szCs w:val="24"/>
+        </w:rPr>
+        <w:t xml:space="preserve">In conclusion, education is the light that shows us the way. As a PCM student, I want to use science and mathematics to solve real problems of my country. If every child in India gets a chance to learn, our nation will surely become strong and developed. As Nelson Mandela said, "Education is the most powerful weapon which you can use to change the world."</w:t>
+      </w:r>
+    </w:p>
+    <w:p>
+      <w:pPr>
+        <w:spacing w:after="120" w:line="300"/>
+      </w:pPr>
+      <w:r>
+        <w:rPr>
+          <w:rFonts w:ascii="Times New Roman" w:cs="Times New Roman" w:eastAsia="Times New Roman" w:hAnsi="Times New Roman"/>
+          <w:i/>
+          <w:iCs/>
+          <w:sz w:val="20"/>
+          <w:szCs w:val="20"/>
+        </w:rPr>
+        <w:t xml:space="preserve">References: NCERT Physics, Chemistry and Mathematics textbooks (Class 11); Wings of Fire by Dr. A.P.J. Abdul Kalam; Nelson Mandela, speech at Madison Park High School, Boston, 2003 (quote).</w:t>
       </w:r>
     </w:p>
     <w:sectPr>

</xml_diff>